<commit_message>
report: small language improvements
</commit_message>
<xml_diff>
--- a/report/Sprawozdanie.docx
+++ b/report/Sprawozdanie.docx
@@ -5662,31 +5662,11 @@
       <w:pPr>
         <w:pStyle w:val="Nagwek3"/>
       </w:pPr>
-      <w:bookmarkStart w:id="2" w:name="_Toc231028528"/>
-      <w:r>
-        <w:t>Motywacja</w:t>
+      <w:bookmarkStart w:id="2" w:name="_Toc231028529"/>
+      <w:r>
+        <w:t>Cel i zakres pracy</w:t>
       </w:r>
       <w:bookmarkEnd w:id="2"/>
-    </w:p>
-    <w:p>
-      <w:r>
-        <w:t>Trudno dziś wyobrazić sobie organizację, która nie korzysta z chmury obliczeniowej. Poczta, dokumenty, bazy danych i całe aplikacje coraz częściej działają na serwerach wynajmowanych od dostawców takich jak Amazon Web Services, Microsoft Azure czy Google Cloud. Wraz z usługami do chmury trafiają jednak dane, w tym te najbardziej wrażliwe, co sprawia, że staje się ona łakomym celem dla cyberprzestępców. Naruszenie danych, czyli ich wyciek lub kradzież, należy do najbardziej kosztownych incydentów bezpieczeństwa, a jego wykrycie często następuje dopiero po wielu tygodniach od momentu włamania.</w:t>
-      </w:r>
-    </w:p>
-    <w:p>
-      <w:r>
-        <w:t>Klasyczne, sygnaturowe systemy ochrony coraz słabiej radzą sobie z nowymi, nieznanymi wcześniej atakami oraz z ogromną skalą i zmiennością ruchu w chmurze. Z tego powodu dużą rolę odgrywają metody uczenia maszynowego, które potrafią samodzielnie uczyć się rozpoznawania złośliwej aktywności na podstawie danych historycznych. Wśród nich szczególne miejsce zajmują dwa podejścia: klasyczne lasy losowe oraz nowsze uczenie głębokie. Oba regularnie osiągają czołowe wyniki, lecz różnią się złożonością, kosztem i łatwością interpretacji decyzji.</w:t>
-      </w:r>
-    </w:p>
-    <w:p>
-      <w:pPr>
-        <w:pStyle w:val="Nagwek3"/>
-      </w:pPr>
-      <w:bookmarkStart w:id="3" w:name="_Toc231028529"/>
-      <w:r>
-        <w:t>Cel i zakres pracy</w:t>
-      </w:r>
-      <w:bookmarkEnd w:id="3"/>
     </w:p>
     <w:p>
       <w:r>
@@ -5738,115 +5718,123 @@
       <w:pPr>
         <w:pStyle w:val="Nagwek3"/>
       </w:pPr>
-      <w:bookmarkStart w:id="4" w:name="_Toc231028530"/>
+      <w:bookmarkStart w:id="3" w:name="_Toc231028530"/>
       <w:r>
         <w:t>Znaczenie problemu</w:t>
+      </w:r>
+      <w:bookmarkEnd w:id="3"/>
+    </w:p>
+    <w:p>
+      <w:r>
+        <w:t>Skala zjawiska sprawia, że temat jest istotny zarówno z perspektywy biznesowej, jak i inżynierskiej. Pojedyncze naruszenie danych potrafi kosztować organizację miliony złotych, licząc koszty bezpośrednie (analiza incydentu, powiadomienia, kary regulacyjne) oraz pośrednie (utrata reputacji i klientów). Dodatkowo czas od włamania do jego wykrycia bywa bardzo długi, co oznacza, że atakujący mają wiele czasu na wyrządzenie szkód. Każde rozwiązanie skracające ten czas, nawet o kilka godzin, ma więc realną wartość. Automatyczne wykrywanie podejrzanego ruchu jest jednym z najtańszych i najszybciej skalujących się sposobów osiągnięcia tego celu, a jego skuteczność zależy wprost od jakości zastosowanego modelu uczenia maszynowego, co czyni porównanie metod tematem o praktycznym znaczeniu.</w:t>
+      </w:r>
+    </w:p>
+    <w:p>
+      <w:pPr>
+        <w:pStyle w:val="Nagwek2"/>
+      </w:pPr>
+      <w:bookmarkStart w:id="4" w:name="_Toc231028531"/>
+      <w:r>
+        <w:t>Tematyka i kontekst</w:t>
       </w:r>
       <w:bookmarkEnd w:id="4"/>
     </w:p>
     <w:p>
-      <w:r>
-        <w:t>Skala zjawiska sprawia, że temat jest istotny zarówno z perspektywy biznesowej, jak i inżynierskiej. Pojedyncze naruszenie danych potrafi kosztować organizację miliony złotych, licząc koszty bezpośrednie (analiza incydentu, powiadomienia, kary regulacyjne) oraz pośrednie (utrata reputacji i klientów). Dodatkowo czas od włamania do jego wykrycia bywa bardzo długi, co oznacza, że atakujący mają wiele czasu na wyrządzenie szkód. Każde rozwiązanie skracające ten czas, nawet o kilka godzin, ma więc realną wartość. Automatyczne wykrywanie podejrzanego ruchu jest jednym z najtańszych i najszybciej skalujących się sposobów osiągnięcia tego celu, a jego skuteczność zależy wprost od jakości zastosowanego modelu uczenia maszynowego, co czyni porównanie metod tematem o praktycznym znaczeniu.</w:t>
-      </w:r>
-    </w:p>
-    <w:p>
-      <w:pPr>
-        <w:pStyle w:val="Nagwek2"/>
-      </w:pPr>
-      <w:bookmarkStart w:id="5" w:name="_Toc231028531"/>
-      <w:r>
-        <w:lastRenderedPageBreak/>
-        <w:t>Tematyka i kontekst</w:t>
+      <w:pPr>
+        <w:pStyle w:val="Nagwek3"/>
+      </w:pPr>
+      <w:bookmarkStart w:id="5" w:name="_Toc231028532"/>
+      <w:r>
+        <w:t>Chmura obliczeniowa</w:t>
       </w:r>
       <w:bookmarkEnd w:id="5"/>
     </w:p>
     <w:p>
+      <w:r>
+        <w:t>Chmura obliczeniowa to model dostarczania zasobów informatycznych (mocy obliczeniowej, pamięci, baz danych, aplikacji) jako usługi dostępnej przez sieć. Zamiast utrzymywać własne serwerownie, organizacje wynajmują zasoby od dostawcy i płacą za ich rzeczywiste wykorzystanie. Wygoda i oszczędność mają jednak swoją cenę: dane wielu klientów żyją na współdzielonej infrastrukturze, dostępnej zdalnie z dowolnego miejsca na świecie, a powierzchnia ataku znacząco rośnie.</w:t>
+      </w:r>
+    </w:p>
+    <w:p>
       <w:pPr>
         <w:pStyle w:val="Nagwek3"/>
       </w:pPr>
-      <w:bookmarkStart w:id="6" w:name="_Toc231028532"/>
-      <w:r>
-        <w:t>Chmura obliczeniowa</w:t>
+      <w:bookmarkStart w:id="6" w:name="_Toc231028533"/>
+      <w:r>
+        <w:t>Modele usług chmurowych</w:t>
       </w:r>
       <w:bookmarkEnd w:id="6"/>
     </w:p>
     <w:p>
       <w:r>
-        <w:t>Chmura obliczeniowa to model dostarczania zasobów informatycznych (mocy obliczeniowej, pamięci, baz danych, aplikacji) jako usługi dostępnej przez sieć. Zamiast utrzymywać własne serwerownie, organizacje wynajmują zasoby od dostawcy i płacą za ich rzeczywiste wykorzystanie. Wygoda i oszczędność mają jednak swoją cenę: dane wielu klientów żyją na współdzielonej infrastrukturze, dostępnej zdalnie z dowolnego miejsca na świecie, a powierzchnia ataku znacząco rośnie.</w:t>
+        <w:t>Chmura dostarczana jest w kilku modelach usługowych, które różnią się zakresem odpowiedzialności klienta. W modelu IaaS (infrastruktura jako usługa) klient otrzymuje maszyny wirtualne i sieć, samodzielnie zarządzając systemem operacyjnym i aplikacjami. W modelu PaaS (platforma jako usługa) dostawca zarządza również środowiskiem uruchomieniowym, a klient skupia się na własnym kodzie. W modelu SaaS (oprogramowanie jako usługa) klient korzysta z gotowej aplikacji przez przeglądarkę. Niezależnie od modelu, komunikacja sieciowa pozostaje wspólnym mianownikiem i nośnikiem śladów potencjalnych ataków, dlatego analiza ruchu sieciowego jest uniwersalnym punktem zaczepienia dla mechanizmów wykrywania naruszeń.</w:t>
       </w:r>
     </w:p>
     <w:p>
       <w:pPr>
         <w:pStyle w:val="Nagwek3"/>
       </w:pPr>
-      <w:bookmarkStart w:id="7" w:name="_Toc231028533"/>
-      <w:r>
-        <w:t>Modele usług chmurowych</w:t>
+      <w:bookmarkStart w:id="7" w:name="_Toc231028534"/>
+      <w:r>
+        <w:lastRenderedPageBreak/>
+        <w:t>Model współdzielonej odpowiedzialności</w:t>
       </w:r>
       <w:bookmarkEnd w:id="7"/>
     </w:p>
     <w:p>
       <w:r>
-        <w:t>Chmura dostarczana jest w kilku modelach usługowych, które różnią się zakresem odpowiedzialności klienta. W modelu IaaS (infrastruktura jako usługa) klient otrzymuje maszyny wirtualne i sieć, samodzielnie zarządzając systemem operacyjnym i aplikacjami. W modelu PaaS (platforma jako usługa) dostawca zarządza również środowiskiem uruchomieniowym, a klient skupia się na własnym kodzie. W modelu SaaS (oprogramowanie jako usługa) klient korzysta z gotowej aplikacji przez przeglądarkę. Niezależnie od modelu, komunikacja sieciowa pozostaje wspólnym mianownikiem i nośnikiem śladów potencjalnych ataków, dlatego analiza ruchu sieciowego jest uniwersalnym punktem zaczepienia dla mechanizmów wykrywania naruszeń.</w:t>
+        <w:t>Bezpieczeństwo w chmurze opiera się na tzw. modelu współdzielonej odpowiedzialności. Dostawca chmury odpowiada za bezpieczeństwo samej infrastruktury (centra danych, sprzęt, wirtualizacja), natomiast za poprawną konfigurację usług, kontrolę dostępu i ochronę własnych danych odpowiada klient. W praktyce ogromna część głośnych wycieków danych wynikała nie z włamania do serwerów dostawcy, lecz z błędów po stronie użytkownika: źle ustawionych uprawnień, publicznie dostępnych zasobów czy przejętych kont. To pokazuje, że samo przeniesienie danych do chmury nie zwalnia organizacji z obowiązku ich monitorowania.</w:t>
       </w:r>
     </w:p>
     <w:p>
       <w:pPr>
         <w:pStyle w:val="Nagwek3"/>
       </w:pPr>
-      <w:bookmarkStart w:id="8" w:name="_Toc231028534"/>
-      <w:r>
-        <w:t>Model współdzielonej odpowiedzialności</w:t>
+      <w:bookmarkStart w:id="8" w:name="_Toc231028535"/>
+      <w:r>
+        <w:t>Rola uczenia maszynowego w cyberbezpieczeństwie</w:t>
       </w:r>
       <w:bookmarkEnd w:id="8"/>
     </w:p>
     <w:p>
       <w:r>
-        <w:t>Bezpieczeństwo w chmurze opiera się na tzw. modelu współdzielonej odpowiedzialności. Dostawca chmury odpowiada za bezpieczeństwo samej infrastruktury (centra danych, sprzęt, wirtualizacja), natomiast za poprawną konfigurację usług, kontrolę dostępu i ochronę własnych danych odpowiada klient. W praktyce ogromna część głośnych wycieków danych wynikała nie z włamania do serwerów dostawcy, lecz z błędów po stronie użytkownika: źle ustawionych uprawnień, publicznie dostępnych zasobów czy przejętych kont. To pokazuje, że samo przeniesienie danych do chmury nie zwalnia organizacji z obowiązku ich monitorowania.</w:t>
+        <w:t>Skala i zmienność ruchu sieciowego w chmurze są tak duże, że ręczn</w:t>
+      </w:r>
+      <w:r>
+        <w:t xml:space="preserve">a kontrola </w:t>
+      </w:r>
+      <w:r>
+        <w:t>bezpieczeństwa przestaje być możliw</w:t>
+      </w:r>
+      <w:r>
+        <w:t>a</w:t>
+      </w:r>
+      <w:r>
+        <w:t>. Uczenie maszynowe pozwala zautomatyzować ten proces: model uczy się rozpoznawać wzorce złośliwej aktywności na podstawie historycznych przykładów, a następnie klasyfikuje nowy ruch w czasie zbliżonym do rzeczywistego. W odróżnieniu od metod sygnaturowych, modele uczenia maszynowego potrafią uogólniać i wykrywać również warianty ataków, których wcześniej nie widziały. To właśnie czyni je obiecującym narzędziem w ochronie danych w chmurze i uzasadnia ich porównanie podjęte w tej pracy.</w:t>
       </w:r>
     </w:p>
     <w:p>
       <w:pPr>
-        <w:pStyle w:val="Nagwek3"/>
-      </w:pPr>
-      <w:bookmarkStart w:id="9" w:name="_Toc231028535"/>
-      <w:r>
-        <w:t>Rola uczenia maszynowego w cyberbezpieczeństwie</w:t>
+        <w:pStyle w:val="Nagwek2"/>
+      </w:pPr>
+      <w:bookmarkStart w:id="9" w:name="_Toc231028536"/>
+      <w:r>
+        <w:t>Opis problemu</w:t>
       </w:r>
       <w:bookmarkEnd w:id="9"/>
     </w:p>
     <w:p>
-      <w:r>
-        <w:t>Skala i zmienność ruchu sieciowego w chmurze są tak duże, że ręczne pilnowanie bezpieczeństwa przestaje być możliwe. Uczenie maszynowe pozwala zautomatyzować ten proces: model uczy się rozpoznawać wzorce złośliwej aktywności na podstawie historycznych przykładów, a następnie klasyfikuje nowy ruch w czasie zbliżonym do rzeczywistego. W odróżnieniu od metod sygnaturowych, modele uczenia maszynowego potrafią uogólniać i wykrywać również warianty ataków, których wcześniej nie widziały. To właśnie czyni je obiecującym narzędziem w ochronie danych w chmurze i uzasadnia ich porównanie podjęte w tej pracy.</w:t>
-      </w:r>
-    </w:p>
-    <w:p>
-      <w:pPr>
-        <w:pStyle w:val="Nagwek2"/>
-      </w:pPr>
-      <w:bookmarkStart w:id="10" w:name="_Toc231028536"/>
-      <w:r>
-        <w:t>Opis problemu</w:t>
+      <w:pPr>
+        <w:pStyle w:val="Nagwek3"/>
+      </w:pPr>
+      <w:bookmarkStart w:id="10" w:name="_Toc231028537"/>
+      <w:r>
+        <w:t>Naruszenia danych w chmurze i ich typy</w:t>
       </w:r>
       <w:bookmarkEnd w:id="10"/>
     </w:p>
     <w:p>
-      <w:pPr>
-        <w:pStyle w:val="Nagwek3"/>
-      </w:pPr>
-      <w:bookmarkStart w:id="11" w:name="_Toc231028537"/>
-      <w:r>
-        <w:t>Naruszenia danych w chmurze i ich typy</w:t>
-      </w:r>
-      <w:bookmarkEnd w:id="11"/>
-    </w:p>
-    <w:p>
-      <w:r>
-        <w:t xml:space="preserve">Naruszenie danych to sytuacja, w której dane trafiają w niepowołane ręce: zostają wykradzione, ujawnione lub zmienione bez uprawnienia. Konsekwencje bywają dotkliwe, od kar </w:t>
-      </w:r>
-      <w:r>
-        <w:lastRenderedPageBreak/>
-        <w:t>finansowych (np. na gruncie RODO), przez utratę zaufania klientów, po realne straty operacyjne. W środowisku chmurowym najczęstsze drogi prowadzące do naruszenia obejmują:</w:t>
+      <w:r>
+        <w:t>Naruszenie danych to sytuacja, w której dane trafiają w niepowołane ręce: zostają wykradzione, ujawnione lub zmienione bez uprawnienia. Konsekwencje bywają dotkliwe, od kar finansowych (np. na gruncie RODO), przez utratę zaufania klientów, po realne straty operacyjne. W środowisku chmurowym najczęstsze drogi prowadzące do naruszenia obejmują:</w:t>
       </w:r>
     </w:p>
     <w:p>
@@ -5858,7 +5846,15 @@
         </w:numPr>
       </w:pPr>
       <w:r>
-        <w:t xml:space="preserve">przejęcie kont, np. zgadywanie haseł metodą brute </w:t>
+        <w:t xml:space="preserve">przejęcie kont, np. zgadywanie haseł metodą </w:t>
+      </w:r>
+      <w:proofErr w:type="spellStart"/>
+      <w:r>
+        <w:t>brute</w:t>
+      </w:r>
+      <w:proofErr w:type="spellEnd"/>
+      <w:r>
+        <w:t xml:space="preserve"> </w:t>
       </w:r>
       <w:proofErr w:type="spellStart"/>
       <w:r>
@@ -5895,11 +5891,11 @@
         </w:numPr>
       </w:pPr>
       <w:r>
-        <w:t>ataki D</w:t>
+        <w:t xml:space="preserve">ataki </w:t>
       </w:r>
       <w:proofErr w:type="spellStart"/>
       <w:r>
-        <w:t>oS</w:t>
+        <w:t>DoS</w:t>
       </w:r>
       <w:proofErr w:type="spellEnd"/>
       <w:r>
@@ -5955,46 +5951,50 @@
       <w:pPr>
         <w:pStyle w:val="Nagwek3"/>
       </w:pPr>
-      <w:bookmarkStart w:id="12" w:name="_Toc231028538"/>
+      <w:bookmarkStart w:id="11" w:name="_Toc231028538"/>
       <w:r>
         <w:t>Przykładowy scenariusz naruszenia</w:t>
+      </w:r>
+      <w:bookmarkEnd w:id="11"/>
+    </w:p>
+    <w:p>
+      <w:r>
+        <w:t xml:space="preserve">Aby zilustrować problem, rozważmy typowy scenariusz. Atakujący najpierw skanuje publicznie dostępne usługi chmurowe ofiary, poszukując otwartych portów. Następnie próbuje uzyskać dostęp do usługi zdalnego logowania, wielokrotnie zgadując hasła (atak brute force). Po przejęciu konta loguje się i rozpoczyna rozpoznanie wewnętrzne, a w końcu kopiuje dane na zewnętrzny serwer. Na każdym z tych etapów powstaje charakterystyczny ruch sieciowy: wiele krótkich połączeń podczas skanowania, liczne nieudane próby logowania, nietypowe połączenia wychodzące podczas eksfiltracji. Model klasyfikujący połączenia ma szansę </w:t>
+      </w:r>
+      <w:r>
+        <w:lastRenderedPageBreak/>
+        <w:t>wychwycić każdy z tych etapów, dając zespołowi bezpieczeństwa czas na reakcję, zanim dojdzie do faktycznej utraty danych.</w:t>
+      </w:r>
+    </w:p>
+    <w:p>
+      <w:pPr>
+        <w:pStyle w:val="Nagwek3"/>
+      </w:pPr>
+      <w:bookmarkStart w:id="12" w:name="_Toc231028539"/>
+      <w:r>
+        <w:t>Sformułowanie zadania klasyfikacji</w:t>
       </w:r>
       <w:bookmarkEnd w:id="12"/>
     </w:p>
     <w:p>
       <w:r>
-        <w:t>Aby zilustrować problem, rozważmy typowy scenariusz. Atakujący najpierw skanuje publicznie dostępne usługi chmurowe ofiary, poszukując otwartych portów. Następnie próbuje uzyskać dostęp do usługi zdalnego logowania, wielokrotnie zgadując hasła (atak brute force). Po przejęciu konta loguje się i rozpoczyna rozpoznanie wewnętrzne, a w końcu kopiuje dane na zewnętrzny serwer. Na każdym z tych etapów powstaje charakterystyczny ruch sieciowy: wiele krótkich połączeń podczas skanowania, liczne nieudane próby logowania, nietypowe połączenia wychodzące podczas eksfiltracji. Model klasyfikujący połączenia ma szansę wychwycić każdy z tych etapów, dając zespołowi bezpieczeństwa czas na reakcję, zanim dojdzie do faktycznej utraty danych.</w:t>
+        <w:t>Naruszenie danych rzadko jest pojedynczym zdarzeniem; to zwykle finał całego łańcucha działań: rozpoznania, włamania, eskalacji uprawnień i wreszcie kradzieży danych. Wykrycie wczesnych ogniw tego łańcucha pełni rolę prognostyczną, bo pozwala zareagować, zanim dojdzie do wycieku. Dlatego prognozowanie naruszenia utożsamiamy z rozpoznawaniem złośliwych połączeń sieciowych.</w:t>
       </w:r>
     </w:p>
     <w:p>
-      <w:pPr>
-        <w:pStyle w:val="Nagwek3"/>
-      </w:pPr>
-      <w:bookmarkStart w:id="13" w:name="_Toc231028539"/>
-      <w:r>
-        <w:t>Sformułowanie zadania klasyfikacji</w:t>
-      </w:r>
-      <w:bookmarkEnd w:id="13"/>
+      <w:r>
+        <w:t>Zadanie sprowadza się do prostego pytania zadawanego dla każdego połączenia: czy to zwykły, normalny ruch, czy raczej atak? Każde połączenie opisujemy zestawem liczb, na przykład jak długo trwało, ile pakietów i bajtów przesłano, jak często czy jakie flagi sieciowe się pojawiły. Na tej podstawie model przykleja jedną z dwóch etykiet: ruch normalny albo atak. Jest to więc klasyczne zadanie klasyfikacji binarnej; ponieważ dane zawierają też informację o rodzaju ataku, możliwa jest dodatkowo analiza poszczególnych typów zagrożeń.</w:t>
+      </w:r>
     </w:p>
     <w:p>
-      <w:r>
-        <w:t>Naruszenie danych rzadko jest pojedynczym zdarzeniem; to zwykle finał całego łańcucha działań: rozpoznania, włamania, eskalacji uprawnień i wreszcie kradzieży danych. Wykrycie wczesnych ogniw tego łańcucha pełni rolę prognostyczną, bo pozwala zareagować, zanim dojdzie do wycieku. Dlatego prognozowanie naruszenia utożsamiamy z rozpoznawaniem złośliwych połączeń sieciowych.</w:t>
-      </w:r>
-    </w:p>
-    <w:p>
-      <w:r>
-        <w:t>Zadanie sprowadza się do prostego pytania zadawanego dla każdego połączenia: czy to zwykły, normalny ruch, czy raczej atak? Każde połączenie opisujemy zestawem liczb, na przykład jak długo trwało, ile pakietów i bajtów przesłano, jak często czy jakie flagi sieciowe się pojawiły. Na tej podstawie model przykleja jedną z dwóch etykiet: ruch normalny albo atak. Jest to więc klasyczne zadanie klasyfikacji binarnej; ponieważ dane zawierają też informację o rodzaju ataku, możliwa jest dodatkowo analiza poszczególnych typów zagrożeń.</w:t>
-      </w:r>
-    </w:p>
-    <w:p>
       <w:pPr>
         <w:pStyle w:val="Nagwek3"/>
       </w:pPr>
-      <w:bookmarkStart w:id="14" w:name="_Toc231028540"/>
+      <w:bookmarkStart w:id="13" w:name="_Toc231028540"/>
       <w:r>
         <w:t>Wyzwania</w:t>
       </w:r>
-      <w:bookmarkEnd w:id="14"/>
+      <w:bookmarkEnd w:id="13"/>
     </w:p>
     <w:p>
       <w:r>
@@ -6034,7 +6034,6 @@
         </w:numPr>
       </w:pPr>
       <w:r>
-        <w:lastRenderedPageBreak/>
         <w:t>Złośliwość kryje się w kombinacjach cech. Pojedyncza cecha rzadko zdradza atak; dopiero ich zestawienie tworzy podejrzany obraz, co wyklucza najprostsze metody liniowe.</w:t>
       </w:r>
     </w:p>
@@ -6054,70 +6053,80 @@
       <w:pPr>
         <w:pStyle w:val="Nagwek2"/>
       </w:pPr>
-      <w:bookmarkStart w:id="15" w:name="_Toc231028541"/>
+      <w:bookmarkStart w:id="14" w:name="_Toc231028541"/>
       <w:r>
         <w:t>Uzasadnienie wybranego podejścia</w:t>
+      </w:r>
+      <w:bookmarkEnd w:id="14"/>
+    </w:p>
+    <w:p>
+      <w:pPr>
+        <w:pStyle w:val="Nagwek3"/>
+      </w:pPr>
+      <w:bookmarkStart w:id="15" w:name="_Toc231028542"/>
+      <w:r>
+        <w:t>Dlaczego porównanie lasu losowego z sieciami głębokimi</w:t>
       </w:r>
       <w:bookmarkEnd w:id="15"/>
     </w:p>
     <w:p>
+      <w:r>
+        <w:t>Spośród wielu metod uczenia maszynowego do porównania wybrano dwie najpopularniejsze i jednocześnie reprezentatywne rodziny. Las losowy to sprawdzona, klasyczna technika, która w zadaniach wykrywania intruzji wielokrotnie osiągała czołowe wyniki przy niewielkim koszcie. Uczenie głębokie reprezentuje natomiast nowoczesny nurt, który zrewolucjonizował analizę obrazów, dźwięku i tekstu. Zestawienie tych dwóch podejść pozwala odpowiedzieć na praktyczne pytanie: czy w ochronie danych w chmurze warto sięgać po skomplikowane sieci neuronowe, czy wystarczy dobrze dobrana metoda klasyczna.</w:t>
+      </w:r>
+    </w:p>
+    <w:p>
       <w:pPr>
         <w:pStyle w:val="Nagwek3"/>
       </w:pPr>
-      <w:bookmarkStart w:id="16" w:name="_Toc231028542"/>
-      <w:r>
-        <w:t>Dlaczego porównanie lasu losowego z sieciami głębokimi</w:t>
+      <w:bookmarkStart w:id="16" w:name="_Toc231028543"/>
+      <w:r>
+        <w:t>Ograniczenia metod sygnaturowych</w:t>
       </w:r>
       <w:bookmarkEnd w:id="16"/>
     </w:p>
     <w:p>
       <w:r>
-        <w:t>Spośród wielu metod uczenia maszynowego do porównania wybrano dwie najpopularniejsze i jednocześnie reprezentatywne rodziny. Las losowy to sprawdzona, klasyczna technika, która w zadaniach wykrywania intruzji wielokrotnie osiągała czołowe wyniki przy niewielkim koszcie. Uczenie głębokie reprezentuje natomiast nowoczesny nurt, który zrewolucjonizował analizę obrazów, dźwięku i tekstu. Zestawienie tych dwóch podejść pozwala odpowiedzieć na praktyczne pytanie: czy w ochronie danych w chmurze warto sięgać po skomplikowane sieci neuronowe, czy wystarczy dobrze dobrana metoda klasyczna.</w:t>
+        <w:t xml:space="preserve">Tradycyjne systemy wykrywania włamań opierają się na sygnaturach, czyli wzorcach znanych ataków. Działają one dobrze, dopóki zagrożenie jest znane, lecz zawodzą wobec nowych wariantów, których sygnatury jeszcze nie powstały. W chmurze, gdzie ruch jest ogromny i zmienny, a atakujący stale modyfikują techniki, podejście sygnaturowe staje się niewystarczające. Uczenie maszynowe uzupełnia tę lukę, ucząc się ogólnych cech złośliwej </w:t>
+      </w:r>
+      <w:r>
+        <w:lastRenderedPageBreak/>
+        <w:t>aktywności zamiast zapamiętywać pojedyncze wzorce, dzięki czemu potrafi rozpoznać również nieznane wcześniej zagrożenia o podobnym charakterze.</w:t>
       </w:r>
     </w:p>
     <w:p>
       <w:pPr>
         <w:pStyle w:val="Nagwek3"/>
       </w:pPr>
-      <w:bookmarkStart w:id="17" w:name="_Toc231028543"/>
-      <w:r>
-        <w:t>Ograniczenia metod sygnaturowych</w:t>
+      <w:bookmarkStart w:id="17" w:name="_Toc231028544"/>
+      <w:r>
+        <w:t>Las losowy</w:t>
       </w:r>
       <w:bookmarkEnd w:id="17"/>
     </w:p>
     <w:p>
       <w:r>
-        <w:t>Tradycyjne systemy wykrywania włamań opierają się na sygnaturach, czyli wzorcach znanych ataków. Działają one dobrze, dopóki zagrożenie jest znane, lecz zawodzą wobec nowych wariantów, których sygnatury jeszcze nie powstały. W chmurze, gdzie ruch jest ogromny i zmienny, a atakujący stale modyfikują techniki, podejście sygnaturowe staje się niewystarczające. Uczenie maszynowe uzupełnia tę lukę, ucząc się ogólnych cech złośliwej aktywności zamiast zapamiętywać pojedyncze wzorce, dzięki czemu potrafi rozpoznać również nieznane wcześniej zagrożenia o podobnym charakterze.</w:t>
+        <w:t xml:space="preserve">Punktem wyjścia jest drzewo decyzyjne, które można sobie wyobrazić jako listę pytań typu: czy liczba pakietów w połączeniu przekracza pewien próg? Odpowiadając na kolejne pytania, schodzimy w dół drzewa aż do liścia, który mówi, czy to ruch normalny, czy atak. Pojedyncze drzewo </w:t>
+      </w:r>
+      <w:r>
+        <w:t xml:space="preserve">natomiast </w:t>
+      </w:r>
+      <w:r>
+        <w:t>łatwo się przeucza. Las losowy rozwiązuje ten problem prostą sztuczką: zamiast jednego drzewa buduje ich setki, a każde uczy na nieco innym, losowym wycinku danych i cech. Decyzja końcowa zapada przez głosowanie, dzięki czemu wynik jest znacznie stabilniejszy. Las losowy nie wymaga skalowania danych, dobrze radzi sobie ze złożonymi zależnościami, szybko się uczy i potrafi wskazać, które cechy były najważniejsze przy podejmowaniu decyzji.</w:t>
       </w:r>
     </w:p>
     <w:p>
       <w:pPr>
         <w:pStyle w:val="Nagwek3"/>
       </w:pPr>
-      <w:bookmarkStart w:id="18" w:name="_Toc231028544"/>
-      <w:r>
-        <w:t>Las losowy</w:t>
+      <w:bookmarkStart w:id="18" w:name="_Toc231028545"/>
+      <w:r>
+        <w:t>Sieci głębokie</w:t>
       </w:r>
       <w:bookmarkEnd w:id="18"/>
     </w:p>
     <w:p>
       <w:r>
-        <w:t>Punktem wyjścia jest drzewo decyzyjne, które można sobie wyobrazić jako listę pytań typu: czy liczba pakietów w połączeniu przekracza pewien próg? Odpowiadając na kolejne pytania, schodzimy w dół drzewa aż do liścia, który mówi, czy to ruch normalny, czy atak. Pojedyncze drzewo jest jednak kapryśne i łatwo się przeucza. Las losowy rozwiązuje ten problem prostą sztuczką: zamiast jednego drzewa buduje ich setki, a każde uczy na nieco innym, losowym wycinku danych i cech. Decyzja końcowa zapada przez głosowanie, dzięki czemu wynik jest znacznie stabilniejszy. Las losowy nie wymaga skalowania danych, dobrze radzi sobie ze złożonymi zależnościami, szybko się uczy i potrafi wskazać, które cechy były najważniejsze przy podejmowaniu decyzji.</w:t>
-      </w:r>
-    </w:p>
-    <w:p>
-      <w:pPr>
-        <w:pStyle w:val="Nagwek3"/>
-      </w:pPr>
-      <w:bookmarkStart w:id="19" w:name="_Toc231028545"/>
-      <w:r>
-        <w:t>Sieci głębokie</w:t>
-      </w:r>
-      <w:bookmarkEnd w:id="19"/>
-    </w:p>
-    <w:p>
-      <w:r>
-        <w:t>Sieć neuronowa to model luźno inspirowany działaniem mózgu, złożony z warstw neuronów. Każdy neuron łączy informacje z poprzedniej warstwy, mnoży je przez wyuczone wagi i przepuszcza przez nieliniową funkcję aktywacji. Określenie głęboka oznacza, że warstw jest wiele, dzięki czemu sieć stopniowo buduje coraz bardziej złożone wzorce: od prostych zależności po abstrakcyjne sygnatury złośliwej aktywności. Uczenie polega na wielokrotnym pokazywaniu sieci przykładów i korygowaniu wag metodą wstecznej propagacji błędu tak, aby sieć coraz rzadziej się myliła. W pracy porównano trzy architektury:</w:t>
+        <w:t>Sieć neuronowa to model inspirowany działaniem mózgu, złożony z warstw neuronów. Każdy neuron łączy informacje z poprzedniej warstwy, mnoży je przez wyuczone wagi i przepuszcza przez nieliniową funkcję aktywacji. Określenie głęboka oznacza, że warstw jest wiele, dzięki czemu sieć stopniowo buduje coraz bardziej złożone wzorce: od prostych zależności po abstrakcyjne sygnatury złośliwej aktywności. Uczenie polega na wielokrotnym pokazywaniu sieci przykładów i korygowaniu wag metodą wstecznej propagacji błędu tak, aby sieć coraz rzadziej się myliła. W pracy porównano trzy architektury:</w:t>
       </w:r>
     </w:p>
     <w:p>
@@ -6129,7 +6138,6 @@
         </w:numPr>
       </w:pPr>
       <w:r>
-        <w:lastRenderedPageBreak/>
         <w:t>MLP (perceptron wielowarstwowy) to najprostsza sieć w pełni połączona, traktująca dane jak zwykłą tabelę liczb; jest naturalnym wyborem dla danych o połączeniach sieciowych.</w:t>
       </w:r>
     </w:p>
@@ -6161,11 +6169,11 @@
       <w:pPr>
         <w:pStyle w:val="Nagwek3"/>
       </w:pPr>
-      <w:bookmarkStart w:id="20" w:name="_Toc231028546"/>
+      <w:bookmarkStart w:id="19" w:name="_Toc231028546"/>
       <w:r>
         <w:t>Miary oceny skuteczności</w:t>
       </w:r>
-      <w:bookmarkEnd w:id="20"/>
+      <w:bookmarkEnd w:id="19"/>
     </w:p>
     <w:p>
       <w:r>
@@ -6229,59 +6237,56 @@
       <w:pPr>
         <w:pStyle w:val="Nagwek3"/>
       </w:pPr>
-      <w:bookmarkStart w:id="21" w:name="_Toc231028547"/>
-      <w:r>
+      <w:bookmarkStart w:id="20" w:name="_Toc231028547"/>
+      <w:r>
+        <w:lastRenderedPageBreak/>
         <w:t>Przegląd literatury</w:t>
+      </w:r>
+      <w:bookmarkEnd w:id="20"/>
+    </w:p>
+    <w:p>
+      <w:r>
+        <w:t>Wykrywanie włamań metodami uczenia maszynowego to dobrze zbadany temat. Powszechnie wykorzystuje się publiczne zbiory danych, takie jak NSL-KDD, UNSW-NB15 czy CIC-IDS2017 i CSE-CIC-IDS2018 przygotowane przez Canadian Institute for Cybersecurity. W wielu badaniach metody oparte na drzewach, jak las losowy, okazują się równie dobre lub lepsze od sieci głębokich, gdy dane mają postać tabeli, a tak właśnie wyglądają cechy połączeń sieciowych. Sieci głębokie błyszczą przede wszystkim tam, gdzie dane są surowe i mają wyraźną strukturę przestrzenną lub czasową. Niniejsza praca sprawdza, czy ta obserwacja potwierdza się również w analizowanym zadaniu chmurowym.</w:t>
+      </w:r>
+    </w:p>
+    <w:p>
+      <w:pPr>
+        <w:pStyle w:val="Nagwek2"/>
+      </w:pPr>
+      <w:bookmarkStart w:id="21" w:name="_Toc231028548"/>
+      <w:r>
+        <w:t>Realizacja zadania</w:t>
       </w:r>
       <w:bookmarkEnd w:id="21"/>
     </w:p>
     <w:p>
-      <w:r>
-        <w:t>Wykrywanie włamań metodami uczenia maszynowego to dobrze zbadany temat. Powszechnie wykorzystuje się publiczne zbiory danych, takie jak NSL-KDD, UNSW-NB15 czy CIC-IDS2017 i CSE-CIC-IDS2018 przygotowane przez Canadian Institute for Cybersecurity. W wielu badaniach metody oparte na drzewach, jak las losowy, okazują się równie dobre lub lepsze od sieci głębokich, gdy dane mają postać tabeli, a tak właśnie wyglądają cechy połączeń sieciowych. Sieci głębokie błyszczą przede wszystkim tam, gdzie dane są surowe i mają wyraźną strukturę przestrzenną lub czasową. Niniejsza praca sprawdza, czy ta obserwacja potwierdza się również w analizowanym zadaniu chmurowym.</w:t>
-      </w:r>
-    </w:p>
-    <w:p>
-      <w:pPr>
-        <w:pStyle w:val="Nagwek2"/>
-      </w:pPr>
-      <w:bookmarkStart w:id="22" w:name="_Toc231028548"/>
-      <w:r>
-        <w:t>Realizacja zadania</w:t>
+      <w:pPr>
+        <w:pStyle w:val="Nagwek3"/>
+      </w:pPr>
+      <w:bookmarkStart w:id="22" w:name="_Toc231028549"/>
+      <w:r>
+        <w:t>Ogólny schemat eksperymentu</w:t>
       </w:r>
       <w:bookmarkEnd w:id="22"/>
     </w:p>
     <w:p>
+      <w:r>
+        <w:t>Aby porównanie było uczciwe, wszystkie modele uczono i testowano na tych samych danych oraz oceniano tymi samymi miarami. Eksperyment przebiega według prostego scenariusza: wczytanie danych, ich przygotowanie, wytrenowanie pięciu modeli (regresji logistycznej, lasu losowego oraz sieci MLP, CNN i LSTM), ocena każdego z nich pod kątem skuteczności i kosztu, a na końcu zebranie wyników w postaci tabel i wykresów.</w:t>
+      </w:r>
+    </w:p>
+    <w:p>
       <w:pPr>
         <w:pStyle w:val="Nagwek3"/>
       </w:pPr>
-      <w:bookmarkStart w:id="23" w:name="_Toc231028549"/>
-      <w:r>
-        <w:t>Ogólny schemat eksperymentu</w:t>
+      <w:bookmarkStart w:id="23" w:name="_Toc231028550"/>
+      <w:r>
+        <w:t>Zbiór danych</w:t>
       </w:r>
       <w:bookmarkEnd w:id="23"/>
     </w:p>
     <w:p>
       <w:r>
-        <w:t>Aby porównanie było uczciwe, wszystkie modele uczono i testowano na tych samych danych oraz oceniano tymi samymi miarami. Eksperyment przebiega według prostego scenariusza: wczytanie danych, ich przygotowanie, wytrenowanie pięciu modeli (regresji logistycznej, lasu losowego oraz sieci MLP, CNN i LSTM), ocena każdego z nich pod kątem skuteczności i kosztu, a na końcu zebranie wyników w postaci tabel i wykresów.</w:t>
-      </w:r>
-    </w:p>
-    <w:p>
-      <w:pPr>
-        <w:pStyle w:val="Nagwek3"/>
-      </w:pPr>
-      <w:bookmarkStart w:id="24" w:name="_Toc231028550"/>
-      <w:r>
-        <w:t>Zbiór danych</w:t>
-      </w:r>
-      <w:bookmarkEnd w:id="24"/>
-    </w:p>
-    <w:p>
-      <w:r>
-        <w:t xml:space="preserve">Głównym zbiorem danych jest CSE-CIC-IDS2018, duży, publicznie dostępny zbiór ruchu sieciowego zebranego na chmurowej infrastrukturze AWS przez Canadian Institute for </w:t>
-      </w:r>
-      <w:r>
-        <w:lastRenderedPageBreak/>
-        <w:t>Cybersecurity. Zawiera on zarówno ruch normalny, jak i różne typy ataków (m.in. łamanie haseł, DoS/DDoS, ataki na aplikacje webowe, infiltrację oraz botnety). Każde połączenie opisane jest kilkudziesięcioma cechami liczbowymi, takimi jak czas trwania, liczba i rozmiar przesłanych pakietów, tempo transmisji czy liczniki flag sieciowych.</w:t>
+        <w:t>Głównym zbiorem danych jest CSE-CIC-IDS2018, duży, publicznie dostępny zbiór ruchu sieciowego zebranego na chmurowej infrastrukturze AWS przez Canadian Institute for Cybersecurity. Zawiera on zarówno ruch normalny, jak i różne typy ataków (m.in. łamanie haseł, DoS/DDoS, ataki na aplikacje webowe, infiltrację oraz botnety). Każde połączenie opisane jest kilkudziesięcioma cechami liczbowymi, takimi jak czas trwania, liczba i rozmiar przesłanych pakietów, tempo transmisji czy liczniki flag sieciowych.</w:t>
       </w:r>
     </w:p>
     <w:p>
@@ -6309,6 +6314,7 @@
         <w:rPr>
           <w:noProof/>
         </w:rPr>
+        <w:lastRenderedPageBreak/>
         <w:drawing>
           <wp:inline distT="0" distB="0" distL="0" distR="0" wp14:anchorId="28AD6016" wp14:editId="1E4BF367">
             <wp:extent cx="4860000" cy="3504807"/>
@@ -6358,11 +6364,11 @@
       <w:pPr>
         <w:pStyle w:val="Nagwek3"/>
       </w:pPr>
-      <w:bookmarkStart w:id="25" w:name="_Toc231028551"/>
+      <w:bookmarkStart w:id="24" w:name="_Toc231028551"/>
       <w:r>
         <w:t>Przetwarzanie wstępne danych</w:t>
       </w:r>
-      <w:bookmarkEnd w:id="25"/>
+      <w:bookmarkEnd w:id="24"/>
     </w:p>
     <w:p>
       <w:r>
@@ -6436,7 +6442,6 @@
     </w:p>
     <w:p>
       <w:r>
-        <w:lastRenderedPageBreak/>
         <w:t>Podział na trzy zbiory pełni ważną rolę metodologiczną. Zbiór uczący służy do dopasowania modelu, zbiór walidacyjny do kontrolowania przebiegu uczenia i decyzji o jego zatrzymaniu, a zbiór testowy, którego model nigdy nie widzi podczas treningu, do uczciwej, końcowej oceny. Podział jest stratyfikowany, co oznacza, że proporcje ruchu normalnego i ataków są w każdym z podzbiorów zbliżone do proporcji w całym zbiorze. Dzięki temu ocena nie jest zafałszowana przez przypadkowy nadmiar lub niedobór ataków w którymś z podzbiorów.</w:t>
       </w:r>
     </w:p>
@@ -6444,11 +6449,11 @@
       <w:pPr>
         <w:pStyle w:val="Nagwek3"/>
       </w:pPr>
-      <w:bookmarkStart w:id="26" w:name="_Toc231028552"/>
+      <w:bookmarkStart w:id="25" w:name="_Toc231028552"/>
       <w:r>
         <w:t>Konfiguracja modeli</w:t>
       </w:r>
-      <w:bookmarkEnd w:id="26"/>
+      <w:bookmarkEnd w:id="25"/>
     </w:p>
     <w:p>
       <w:r>
@@ -6500,6 +6505,7 @@
         </w:numPr>
       </w:pPr>
       <w:r>
+        <w:lastRenderedPageBreak/>
         <w:t xml:space="preserve">CNN 1D: sieć </w:t>
       </w:r>
       <w:proofErr w:type="spellStart"/>
@@ -6532,63 +6538,57 @@
       <w:pPr>
         <w:pStyle w:val="Nagwek3"/>
       </w:pPr>
-      <w:bookmarkStart w:id="27" w:name="_Toc231028553"/>
+      <w:bookmarkStart w:id="26" w:name="_Toc231028553"/>
       <w:r>
         <w:t>Środowisko i narzędzia</w:t>
+      </w:r>
+      <w:bookmarkEnd w:id="26"/>
+    </w:p>
+    <w:p>
+      <w:r>
+        <w:t xml:space="preserve">Całość zaimplementowano w języku Python. Modele klasyczne zbudowano przy użyciu biblioteki scikit-learn, a sieci głębokie w bibliotece </w:t>
+      </w:r>
+      <w:proofErr w:type="spellStart"/>
+      <w:r>
+        <w:t>PyTorch</w:t>
+      </w:r>
+      <w:proofErr w:type="spellEnd"/>
+      <w:r>
+        <w:t xml:space="preserve">. Wykresy przygotowano w bibliotece </w:t>
+      </w:r>
+      <w:proofErr w:type="spellStart"/>
+      <w:r>
+        <w:t>matplotlib</w:t>
+      </w:r>
+      <w:proofErr w:type="spellEnd"/>
+      <w:r>
+        <w:t>.</w:t>
+      </w:r>
+    </w:p>
+    <w:p>
+      <w:pPr>
+        <w:pStyle w:val="Nagwek2"/>
+      </w:pPr>
+      <w:bookmarkStart w:id="27" w:name="_Toc231028554"/>
+      <w:r>
+        <w:t>Implementacja programu</w:t>
       </w:r>
       <w:bookmarkEnd w:id="27"/>
     </w:p>
     <w:p>
       <w:r>
-        <w:t xml:space="preserve">Całość zaimplementowano w języku Python. Modele klasyczne zbudowano przy użyciu biblioteki scikit-learn, a sieci głębokie w bibliotece </w:t>
-      </w:r>
-      <w:proofErr w:type="spellStart"/>
-      <w:r>
-        <w:t>PyTorch</w:t>
-      </w:r>
-      <w:proofErr w:type="spellEnd"/>
-      <w:r>
-        <w:t>. Wykresy przygotowano w bibliotece matplotlib. Obliczenia prowadzono na</w:t>
-      </w:r>
-      <w:r>
-        <w:t xml:space="preserve"> komputerze Apple </w:t>
-      </w:r>
-      <w:proofErr w:type="spellStart"/>
-      <w:r>
-        <w:t>Macbook</w:t>
-      </w:r>
-      <w:proofErr w:type="spellEnd"/>
-      <w:r>
-        <w:t xml:space="preserve"> Pro z procesorem M3 Pro oraz 18GB pamięci RAM</w:t>
-      </w:r>
-      <w:r>
-        <w:t>.</w:t>
+        <w:t>Niniejszy rozdział opisuje szczegóły implementacyjne programu napisanego na potrzeby eksperymentu. Całość powstała w języku Python i została podzielona na niezależne moduły o jasno określonej odpowiedzialności, co ułatwia zrozumienie kodu, jego testowanie oraz rozszerzanie o nowe modele i zbiory danych.</w:t>
       </w:r>
     </w:p>
     <w:p>
       <w:pPr>
-        <w:pStyle w:val="Nagwek2"/>
-      </w:pPr>
-      <w:bookmarkStart w:id="28" w:name="_Toc231028554"/>
-      <w:r>
-        <w:t>Implementacja programu</w:t>
+        <w:pStyle w:val="Nagwek3"/>
+      </w:pPr>
+      <w:bookmarkStart w:id="28" w:name="_Toc231028555"/>
+      <w:r>
+        <w:t>Organizacja kodu</w:t>
       </w:r>
       <w:bookmarkEnd w:id="28"/>
-    </w:p>
-    <w:p>
-      <w:r>
-        <w:t>Niniejszy rozdział opisuje szczegóły implementacyjne programu napisanego na potrzeby eksperymentu. Całość powstała w języku Python i została podzielona na niezależne moduły o jasno określonej odpowiedzialności, co ułatwia zrozumienie kodu, jego testowanie oraz rozszerzanie o nowe modele i zbiory danych.</w:t>
-      </w:r>
-    </w:p>
-    <w:p>
-      <w:pPr>
-        <w:pStyle w:val="Nagwek3"/>
-      </w:pPr>
-      <w:bookmarkStart w:id="29" w:name="_Toc231028555"/>
-      <w:r>
-        <w:t>Organizacja kodu</w:t>
-      </w:r>
-      <w:bookmarkEnd w:id="29"/>
     </w:p>
     <w:p>
       <w:r>
@@ -6720,13 +6720,6 @@
           <w:sz w:val="18"/>
         </w:rPr>
         <w:br/>
-      </w:r>
-      <w:r>
-        <w:rPr>
-          <w:rFonts w:ascii="Consolas" w:hAnsi="Consolas" w:cs="Consolas"/>
-          <w:sz w:val="18"/>
-        </w:rPr>
-        <w:lastRenderedPageBreak/>
         <w:t xml:space="preserve">  tables.py          # eksport tabel wynikow</w:t>
       </w:r>
       <w:r>
@@ -6750,11 +6743,11 @@
       <w:pPr>
         <w:pStyle w:val="Nagwek3"/>
       </w:pPr>
-      <w:bookmarkStart w:id="30" w:name="_Toc231028556"/>
+      <w:bookmarkStart w:id="29" w:name="_Toc231028556"/>
       <w:r>
         <w:t>Konfiguracja eksperymentu</w:t>
       </w:r>
-      <w:bookmarkEnd w:id="30"/>
+      <w:bookmarkEnd w:id="29"/>
     </w:p>
     <w:p>
       <w:r>
@@ -6903,6 +6896,14 @@
           <w:lang w:val="en-GB"/>
         </w:rPr>
         <w:br/>
+      </w:r>
+      <w:r>
+        <w:rPr>
+          <w:rFonts w:ascii="Consolas" w:hAnsi="Consolas" w:cs="Consolas"/>
+          <w:sz w:val="18"/>
+          <w:lang w:val="en-GB"/>
+        </w:rPr>
+        <w:lastRenderedPageBreak/>
         <w:t>@dataclass</w:t>
       </w:r>
       <w:r>
@@ -7062,11 +7063,11 @@
       <w:pPr>
         <w:pStyle w:val="Nagwek3"/>
       </w:pPr>
-      <w:bookmarkStart w:id="31" w:name="_Toc231028557"/>
+      <w:bookmarkStart w:id="30" w:name="_Toc231028557"/>
       <w:r>
         <w:t>Pozyskiwanie i przygotowanie danych</w:t>
       </w:r>
-      <w:bookmarkEnd w:id="31"/>
+      <w:bookmarkEnd w:id="30"/>
     </w:p>
     <w:p>
       <w:r>
@@ -7374,11 +7375,11 @@
       <w:pPr>
         <w:pStyle w:val="Nagwek3"/>
       </w:pPr>
-      <w:bookmarkStart w:id="32" w:name="_Toc231028558"/>
+      <w:bookmarkStart w:id="31" w:name="_Toc231028558"/>
       <w:r>
         <w:t>Implementacja modeli</w:t>
       </w:r>
-      <w:bookmarkEnd w:id="32"/>
+      <w:bookmarkEnd w:id="31"/>
     </w:p>
     <w:p>
       <w:r>
@@ -7398,7 +7399,6 @@
           <w:rFonts w:ascii="Consolas" w:hAnsi="Consolas" w:cs="Consolas"/>
           <w:sz w:val="18"/>
         </w:rPr>
-        <w:lastRenderedPageBreak/>
         <w:t>class CNN1D(nn.Module):</w:t>
       </w:r>
       <w:r>
@@ -7507,11 +7507,12 @@
       <w:pPr>
         <w:pStyle w:val="Nagwek3"/>
       </w:pPr>
-      <w:bookmarkStart w:id="33" w:name="_Toc231028559"/>
-      <w:r>
+      <w:bookmarkStart w:id="32" w:name="_Toc231028559"/>
+      <w:r>
+        <w:lastRenderedPageBreak/>
         <w:t>Trening, ewaluacja i wizualizacja</w:t>
       </w:r>
-      <w:bookmarkEnd w:id="33"/>
+      <w:bookmarkEnd w:id="32"/>
     </w:p>
     <w:p>
       <w:r>
@@ -7522,11 +7523,11 @@
       <w:pPr>
         <w:pStyle w:val="Nagwek3"/>
       </w:pPr>
-      <w:bookmarkStart w:id="34" w:name="_Toc231028560"/>
+      <w:bookmarkStart w:id="33" w:name="_Toc231028560"/>
       <w:r>
         <w:t>Sposób uruchomienia</w:t>
       </w:r>
-      <w:bookmarkEnd w:id="34"/>
+      <w:bookmarkEnd w:id="33"/>
     </w:p>
     <w:p>
       <w:r>
@@ -7615,21 +7616,21 @@
       <w:pPr>
         <w:pStyle w:val="Nagwek2"/>
       </w:pPr>
-      <w:bookmarkStart w:id="35" w:name="_Toc231028561"/>
+      <w:bookmarkStart w:id="34" w:name="_Toc231028561"/>
       <w:r>
         <w:t>Wyniki i analiza</w:t>
       </w:r>
-      <w:bookmarkEnd w:id="35"/>
+      <w:bookmarkEnd w:id="34"/>
     </w:p>
     <w:p>
       <w:pPr>
         <w:pStyle w:val="Nagwek3"/>
       </w:pPr>
-      <w:bookmarkStart w:id="36" w:name="_Toc231028562"/>
+      <w:bookmarkStart w:id="35" w:name="_Toc231028562"/>
       <w:r>
         <w:t>Skuteczność modeli</w:t>
       </w:r>
-      <w:bookmarkEnd w:id="36"/>
+      <w:bookmarkEnd w:id="35"/>
     </w:p>
     <w:p>
       <w:r>
@@ -8249,7 +8250,6 @@
         <w:pStyle w:val="Legenda"/>
       </w:pPr>
       <w:r>
-        <w:lastRenderedPageBreak/>
         <w:t>Tabela 1. Skuteczność modeli na zbiorze testowym.</w:t>
       </w:r>
     </w:p>
@@ -8266,6 +8266,7 @@
         <w:rPr>
           <w:noProof/>
         </w:rPr>
+        <w:lastRenderedPageBreak/>
         <w:drawing>
           <wp:inline distT="0" distB="0" distL="0" distR="0" wp14:anchorId="62C56DDD" wp14:editId="4B14A102">
             <wp:extent cx="5400000" cy="2891891"/>
@@ -8315,11 +8316,11 @@
       <w:pPr>
         <w:pStyle w:val="Nagwek3"/>
       </w:pPr>
-      <w:bookmarkStart w:id="37" w:name="_Toc231028563"/>
+      <w:bookmarkStart w:id="36" w:name="_Toc231028563"/>
       <w:r>
         <w:t>Krzywe ROC i precyzja-czułość</w:t>
       </w:r>
-      <w:bookmarkEnd w:id="37"/>
+      <w:bookmarkEnd w:id="36"/>
     </w:p>
     <w:p>
       <w:r>
@@ -8335,7 +8336,6 @@
         <w:rPr>
           <w:noProof/>
         </w:rPr>
-        <w:lastRenderedPageBreak/>
         <w:drawing>
           <wp:inline distT="0" distB="0" distL="0" distR="0" wp14:anchorId="7171AEE1" wp14:editId="314ECFD2">
             <wp:extent cx="4140000" cy="3622500"/>
@@ -8389,6 +8389,7 @@
         <w:rPr>
           <w:noProof/>
         </w:rPr>
+        <w:lastRenderedPageBreak/>
         <w:drawing>
           <wp:inline distT="0" distB="0" distL="0" distR="0" wp14:anchorId="37877C4A" wp14:editId="63B7E3EB">
             <wp:extent cx="4140000" cy="3628449"/>
@@ -8438,19 +8439,15 @@
       <w:pPr>
         <w:pStyle w:val="Nagwek3"/>
       </w:pPr>
-      <w:bookmarkStart w:id="38" w:name="_Toc231028564"/>
+      <w:bookmarkStart w:id="37" w:name="_Toc231028564"/>
       <w:r>
         <w:t>Analiza błędów</w:t>
       </w:r>
-      <w:bookmarkEnd w:id="38"/>
+      <w:bookmarkEnd w:id="37"/>
     </w:p>
     <w:p>
       <w:r>
-        <w:t xml:space="preserve">Macierze pomyłek na rysunku 5 pozwalają zobaczyć, jakie błędy popełniają modele. Las losowy wychwytuje najwięcej ataków (najwyższa czułość), czyli rzadziej przepuszcza zagrożenie, co w kontekście ochrony danych jest cenne, bo przeoczone naruszenie kosztuje najwięcej. Sieć CNN nieco rzadziej podnosi fałszywy alarm (najwyższa precyzja), czyli mniej </w:t>
-      </w:r>
-      <w:r>
-        <w:lastRenderedPageBreak/>
-        <w:t>obciąża zespół bezpieczeństwa niepotrzebnymi powiadomieniami. W praktyce punkt równowagi między tymi błędami można regulować progiem decyzyjnym, dopasowując go do polityki bezpieczeństwa organizacji.</w:t>
+        <w:t>Macierze pomyłek na rysunku 5 pozwalają zobaczyć, jakie błędy popełniają modele. Las losowy wychwytuje najwięcej ataków (najwyższa czułość), czyli rzadziej przepuszcza zagrożenie, co w kontekście ochrony danych jest cenne, bo przeoczone naruszenie kosztuje najwięcej. Sieć CNN nieco rzadziej podnosi fałszywy alarm (najwyższa precyzja), czyli mniej obciąża zespół bezpieczeństwa niepotrzebnymi powiadomieniami. W praktyce punkt równowagi między tymi błędami można regulować progiem decyzyjnym, dopasowując go do polityki bezpieczeństwa organizacji.</w:t>
       </w:r>
     </w:p>
     <w:p>
@@ -8467,6 +8464,7 @@
         <w:rPr>
           <w:noProof/>
         </w:rPr>
+        <w:lastRenderedPageBreak/>
         <w:drawing>
           <wp:inline distT="0" distB="0" distL="0" distR="0" wp14:anchorId="20AFA1B0" wp14:editId="0CDAA552">
             <wp:extent cx="5400000" cy="3324694"/>
@@ -8516,11 +8514,11 @@
       <w:pPr>
         <w:pStyle w:val="Nagwek3"/>
       </w:pPr>
-      <w:bookmarkStart w:id="39" w:name="_Toc231028565"/>
+      <w:bookmarkStart w:id="38" w:name="_Toc231028565"/>
       <w:r>
         <w:t>Wydajność i koszt obliczeniowy</w:t>
       </w:r>
-      <w:bookmarkEnd w:id="39"/>
+      <w:bookmarkEnd w:id="38"/>
     </w:p>
     <w:p>
       <w:r>
@@ -8902,11 +8900,7 @@
     </w:p>
     <w:p>
       <w:r>
-        <w:t xml:space="preserve">I tu pojawia się sedno sprawy. Las losowy uczy się w zaledwie kilka sekund, podczas gdy najlepszy model głęboki potrzebuje kilkudziesięciu razy więcej czasu, by osiągnąć praktycznie ten sam wynik. Najbardziej rozbudowana sieć LSTM trenuje się ponad osiem minut, a mimo to wypada słabiej. Również w fazie działania las losowy i proste modele są wyraźnie szybsze od sieci CNN i LSTM. Kompromis między kosztem a skutecznością dobrze obrazuje rysunek </w:t>
-      </w:r>
-      <w:r>
-        <w:lastRenderedPageBreak/>
-        <w:t>6: najbardziej opłacalne modele leżą w lewej górnej części wykresu, czyli osiągają wysoką skuteczność przy krótkim czasie uczenia.</w:t>
+        <w:t>Las losowy uczy się w zaledwie kilka sekund, podczas gdy najlepszy model głęboki potrzebuje kilkudziesięciu razy więcej czasu, by osiągnąć praktycznie ten sam wynik. Najbardziej rozbudowana sieć LSTM trenuje się ponad osiem minut, a mimo to wypada słabiej. Również w fazie działania las losowy i proste modele są wyraźnie szybsze od sieci CNN i LSTM. Kompromis między kosztem a skutecznością dobrze obrazuje rysunek 6: najbardziej opłacalne modele leżą w lewej górnej części wykresu, czyli osiągają wysoką skuteczność przy krótkim czasie uczenia.</w:t>
       </w:r>
     </w:p>
     <w:p/>
@@ -8918,6 +8912,7 @@
         <w:rPr>
           <w:noProof/>
         </w:rPr>
+        <w:lastRenderedPageBreak/>
         <w:drawing>
           <wp:inline distT="0" distB="0" distL="0" distR="0" wp14:anchorId="3B050019" wp14:editId="49E19998">
             <wp:extent cx="4500000" cy="3298203"/>
@@ -8967,11 +8962,11 @@
       <w:pPr>
         <w:pStyle w:val="Nagwek3"/>
       </w:pPr>
-      <w:bookmarkStart w:id="40" w:name="_Toc231028566"/>
+      <w:bookmarkStart w:id="39" w:name="_Toc231028566"/>
       <w:r>
         <w:t>Przebieg uczenia modeli głębokich</w:t>
       </w:r>
-      <w:bookmarkEnd w:id="40"/>
+      <w:bookmarkEnd w:id="39"/>
     </w:p>
     <w:p>
       <w:r>
@@ -9036,19 +9031,15 @@
       <w:pPr>
         <w:pStyle w:val="Nagwek3"/>
       </w:pPr>
-      <w:bookmarkStart w:id="41" w:name="_Toc231028567"/>
+      <w:bookmarkStart w:id="40" w:name="_Toc231028567"/>
       <w:r>
         <w:t>Interpretowalność i ważność cech</w:t>
       </w:r>
-      <w:bookmarkEnd w:id="41"/>
+      <w:bookmarkEnd w:id="40"/>
     </w:p>
     <w:p>
       <w:r>
-        <w:t xml:space="preserve">Dodatkową zaletą lasu losowego jest interpretowalność. Rysunek 8 przedstawia najważniejsze cechy według miary ważności Giniego. Pozwala to zidentyfikować, które statystyki połączenia </w:t>
-      </w:r>
-      <w:r>
-        <w:lastRenderedPageBreak/>
-        <w:t>najsilniej różnicują ruch złośliwy i normalny, co jest cenną informacją dla analityków bezpieczeństwa, a trudniej dostępną w modelach głębokich działających jak czarna skrzynka.</w:t>
+        <w:t>Dodatkową zaletą lasu losowego jest interpretowalność. Rysunek 8 przedstawia najważniejsze cechy według miary ważności Giniego. Pozwala to zidentyfikować, które statystyki połączenia najsilniej różnicują ruch złośliwy i normalny, co jest cenną informacją dla analityków bezpieczeństwa, a trudniej dostępną w modelach głębokich działających jak czarna skrzynka.</w:t>
       </w:r>
     </w:p>
     <w:p>
@@ -9059,6 +9050,7 @@
         <w:rPr>
           <w:noProof/>
         </w:rPr>
+        <w:lastRenderedPageBreak/>
         <w:drawing>
           <wp:inline distT="0" distB="0" distL="0" distR="0" wp14:anchorId="3F406A09" wp14:editId="2530ADC4">
             <wp:extent cx="4500000" cy="3014851"/>
@@ -9113,107 +9105,105 @@
       <w:pPr>
         <w:pStyle w:val="Nagwek3"/>
       </w:pPr>
-      <w:bookmarkStart w:id="42" w:name="_Toc231028568"/>
+      <w:bookmarkStart w:id="41" w:name="_Toc231028568"/>
       <w:r>
         <w:t>Synteza wyników</w:t>
+      </w:r>
+      <w:bookmarkEnd w:id="41"/>
+    </w:p>
+    <w:p>
+      <w:r>
+        <w:t>Podsumowując, zebrane wyniki pozwalają wstępnie odpowiedzieć na postawione pytania badawcze. Pod względem skuteczności las losowy i najlepsza sieć są praktycznie nierozróżnialne, przy czym las losowy wykrywa najwięcej ataków. Pod względem kosztu las losowy jest zdecydowanie tańszy, oferując najlepszą relację skuteczność do nakładu obliczeniowego. Rozbudowane sieci sekwencyjne nie przyniosły przewagi, co oznacza, że większa złożoność nie przełożyła się na lepsze wyniki. Szczegółową interpretację tych obserwacji w kontekście wdrożeń chmurowych zawiera kolejny rozdział.</w:t>
+      </w:r>
+    </w:p>
+    <w:p>
+      <w:pPr>
+        <w:pStyle w:val="Nagwek2"/>
+      </w:pPr>
+      <w:r>
+        <w:t>Refleksja</w:t>
+      </w:r>
+    </w:p>
+    <w:p>
+      <w:pPr>
+        <w:pStyle w:val="Nagwek3"/>
+      </w:pPr>
+      <w:bookmarkStart w:id="42" w:name="_Toc231028570"/>
+      <w:r>
+        <w:t>Skuteczność a koszt w realiach chmury</w:t>
       </w:r>
       <w:bookmarkEnd w:id="42"/>
     </w:p>
     <w:p>
       <w:r>
-        <w:t>Podsumowując, zebrane wyniki pozwalają wstępnie odpowiedzieć na postawione pytania badawcze. Pod względem skuteczności las losowy i najlepsza sieć są praktycznie nierozróżnialne, przy czym las losowy wykrywa najwięcej ataków. Pod względem kosztu las losowy jest zdecydowanie tańszy, oferując najlepszą relację skuteczność do nakładu obliczeniowego. Rozbudowane sieci sekwencyjne nie przyniosły przewagi, co oznacza, że większa złożoność nie przełożyła się na lepsze wyniki. Szczegółową interpretację tych obserwacji w kontekście wdrożeń chmurowych zawiera kolejny rozdział.</w:t>
+        <w:t>Zestawienie skuteczności i kosztu prowadzi do najważniejszego spostrzeżenia tej pracy. W warunkach laboratoryjnych można pozwolić sobie na wielogodzinne treningi, jednak w chmurze sytuacja wygląda inaczej: modele bezpieczeństwa często wymagają regularnego dotrenowywania na świeżych danych, a czas obliczeń przekłada się wprost na koszt wynajmowanych zasobów. W tym świetle model osiągający niemal identyczną skuteczność kilkadziesiąt razy szybciej jest rozwiązaniem wyraźnie korzystniejszym ekonomicznie. Różnica w jakości między najlepszą siecią a lasem losowym jest na tyle mała, że w praktyce trudno ją odróżnić od szumu wynikającego z losowości danych, podczas gdy różnica w koszcie jest ogromna i jednoznaczna.</w:t>
       </w:r>
     </w:p>
     <w:p>
       <w:pPr>
-        <w:pStyle w:val="Nagwek2"/>
-      </w:pPr>
-      <w:bookmarkStart w:id="43" w:name="_Toc231028569"/>
-      <w:r>
-        <w:t>Dyskusja</w:t>
+        <w:pStyle w:val="Nagwek3"/>
+      </w:pPr>
+      <w:bookmarkStart w:id="43" w:name="_Toc231028571"/>
+      <w:r>
+        <w:lastRenderedPageBreak/>
+        <w:t>Interpretowalność i zaufanie</w:t>
       </w:r>
       <w:bookmarkEnd w:id="43"/>
     </w:p>
     <w:p>
+      <w:r>
+        <w:t>W bezpieczeństwie liczy się nie tylko trafność decyzji, lecz także możliwość jej wyjaśnienia. Analityk, który otrzymuje alarm, musi zrozumieć, dlaczego dane połączenie uznano za złośliwe, aby podjąć właściwą reakcję i uniknąć ślepego zaufania automatowi. Las losowy ma tu naturalną przewagę: udostępnia ranking ważności cech i pozwala prześledzić ścieżkę decyzji w drzewach. Sieci głębokie działają natomiast jak czarna skrzynka i wymagają dodatkowych, kosztownych technik wyjaśniania. Ten aspekt, choć trudny do ujęcia w pojedynczej metryce, ma duże znaczenie przy wdrożeniach produkcyjnych.</w:t>
+      </w:r>
+    </w:p>
+    <w:p>
       <w:pPr>
         <w:pStyle w:val="Nagwek3"/>
       </w:pPr>
-      <w:bookmarkStart w:id="44" w:name="_Toc231028570"/>
-      <w:r>
-        <w:t>Skuteczność a koszt w realiach chmury</w:t>
+      <w:bookmarkStart w:id="44" w:name="_Toc231028572"/>
+      <w:r>
+        <w:t>Ograniczenia danych tabelarycznych dla sieci głębokich</w:t>
       </w:r>
       <w:bookmarkEnd w:id="44"/>
     </w:p>
     <w:p>
       <w:r>
-        <w:t>Zestawienie skuteczności i kosztu prowadzi do najważniejszego spostrzeżenia tej pracy. W warunkach laboratoryjnych można pozwolić sobie na wielogodzinne treningi, jednak w chmurze sytuacja wygląda inaczej: modele bezpieczeństwa często wymagają regularnego dotrenowywania na świeżych danych, a czas obliczeń przekłada się wprost na koszt wynajmowanych zasobów. W tym świetle model osiągający niemal identyczną skuteczność kilkadziesiąt razy szybciej jest rozwiązaniem wyraźnie korzystniejszym ekonomicznie. Różnica w jakości między najlepszą siecią a lasem losowym jest na tyle mała, że w praktyce trudno ją odróżnić od szumu wynikającego z losowości danych, podczas gdy różnica w koszcie jest ogromna i jednoznaczna.</w:t>
+        <w:t>Uzyskane wyniki wpisują się w szerszą, znaną z literatury obserwację: na danych w postaci tabeli metody oparte na drzewach pozostają wyjątkowo konkurencyjne, a sieci głębokie nie wykorzystują swojej największej zalety, czyli zdolności do uczenia się reprezentacji z danych surowych. Cechy połączeń sieciowych są już bowiem starannie zaprojektowane przez ekspertów, więc dodatkowa moc sieci głębokich nie ma tu wiele do odkrycia. Tłumaczy to, dlaczego rozbudowane architektury sekwencyjne nie przyniosły przewagi, a najlepiej spośród sieci wypadły rozwiązania prostsze.</w:t>
       </w:r>
     </w:p>
     <w:p>
       <w:pPr>
         <w:pStyle w:val="Nagwek3"/>
       </w:pPr>
-      <w:bookmarkStart w:id="45" w:name="_Toc231028571"/>
-      <w:r>
-        <w:lastRenderedPageBreak/>
-        <w:t>Interpretowalność i zaufanie</w:t>
+      <w:bookmarkStart w:id="45" w:name="_Toc231028573"/>
+      <w:r>
+        <w:t>Rekomendacje wdrożeniowe</w:t>
       </w:r>
       <w:bookmarkEnd w:id="45"/>
     </w:p>
     <w:p>
       <w:r>
-        <w:t>W bezpieczeństwie liczy się nie tylko trafność decyzji, lecz także możliwość jej wyjaśnienia. Analityk, który otrzymuje alarm, musi zrozumieć, dlaczego dane połączenie uznano za złośliwe, aby podjąć właściwą reakcję i uniknąć ślepego zaufania automatowi. Las losowy ma tu naturalną przewagę: udostępnia ranking ważności cech i pozwala prześledzić ścieżkę decyzji w drzewach. Sieci głębokie działają natomiast jak czarna skrzynka i wymagają dodatkowych, kosztownych technik wyjaśniania. Ten aspekt, choć trudny do ujęcia w pojedynczej metryce, ma duże znaczenie przy wdrożeniach produkcyjnych.</w:t>
+        <w:t>Na podstawie przeprowadzonej analizy można sformułować praktyczne rekomendacje. Jako domyślny wybór dla systemu wykrywania naruszeń w chmurze rozsądnie jest przyjąć las losowy: zapewnia on bardzo dobrą skuteczność, niski koszt treningu i działania, łatwość dotrenowywania oraz interpretowalność wspierającą pracę analityków. Sieć głęboką warto rozważyć jako uzupełnienie tam, gdzie priorytetem jest ograniczanie fałszywych alarmów i gdzie dostępne są akceleratory GPU obniżające koszt treningu. Niezależnie od wyboru modelu, próg decyzyjny powinien być dostrojony do polityki bezpieczeństwa: w środowiskach o wysokiej wrażliwości danych korzystniej jest preferować wyższą czułość kosztem większej liczby alarmów, natomiast tam, gdzie zespół jest niewielki, większą wagę przykłada się do precyzji. Dobrą praktyką jest również łączenie modelu uczenia maszynowego z klasycznymi regułami i monitorowaniem, tak aby decyzja nie opierała się na pojedynczym źródle.</w:t>
       </w:r>
     </w:p>
     <w:p>
       <w:pPr>
-        <w:pStyle w:val="Nagwek3"/>
-      </w:pPr>
-      <w:bookmarkStart w:id="46" w:name="_Toc231028572"/>
-      <w:r>
-        <w:t>Ograniczenia danych tabelarycznych dla sieci głębokich</w:t>
+        <w:pStyle w:val="Nagwek2"/>
+      </w:pPr>
+      <w:bookmarkStart w:id="46" w:name="_Toc231028574"/>
+      <w:r>
+        <w:t>Wnioski końcowe</w:t>
       </w:r>
       <w:bookmarkEnd w:id="46"/>
     </w:p>
     <w:p>
-      <w:r>
-        <w:t>Uzyskane wyniki wpisują się w szerszą, znaną z literatury obserwację: na danych w postaci tabeli metody oparte na drzewach pozostają wyjątkowo konkurencyjne, a sieci głębokie nie wykorzystują swojej największej zalety, czyli zdolności do uczenia się reprezentacji z danych surowych. Cechy połączeń sieciowych są już bowiem starannie zaprojektowane przez ekspertów, więc dodatkowa moc sieci głębokich nie ma tu wiele do odkrycia. Tłumaczy to, dlaczego rozbudowane architektury sekwencyjne nie przyniosły przewagi, a najlepiej spośród sieci wypadły rozwiązania prostsze.</w:t>
-      </w:r>
-    </w:p>
-    <w:p>
       <w:pPr>
         <w:pStyle w:val="Nagwek3"/>
       </w:pPr>
-      <w:bookmarkStart w:id="47" w:name="_Toc231028573"/>
-      <w:r>
-        <w:t>Rekomendacje wdrożeniowe</w:t>
+      <w:bookmarkStart w:id="47" w:name="_Toc231028575"/>
+      <w:r>
+        <w:t>Podsumowanie</w:t>
       </w:r>
       <w:bookmarkEnd w:id="47"/>
-    </w:p>
-    <w:p>
-      <w:r>
-        <w:t>Na podstawie przeprowadzonej analizy można sformułować praktyczne rekomendacje. Jako domyślny wybór dla systemu wykrywania naruszeń w chmurze rozsądnie jest przyjąć las losowy: zapewnia on bardzo dobrą skuteczność, niski koszt treningu i działania, łatwość dotrenowywania oraz interpretowalność wspierającą pracę analityków. Sieć głęboką warto rozważyć jako uzupełnienie tam, gdzie priorytetem jest ograniczanie fałszywych alarmów i gdzie dostępne są akceleratory GPU obniżające koszt treningu. Niezależnie od wyboru modelu, próg decyzyjny powinien być dostrojony do polityki bezpieczeństwa: w środowiskach o wysokiej wrażliwości danych korzystniej jest preferować wyższą czułość kosztem większej liczby alarmów, natomiast tam, gdzie zespół jest niewielki, większą wagę przykłada się do precyzji. Dobrą praktyką jest również łączenie modelu uczenia maszynowego z klasycznymi regułami i monitorowaniem, tak aby decyzja nie opierała się na pojedynczym źródle.</w:t>
-      </w:r>
-    </w:p>
-    <w:p>
-      <w:pPr>
-        <w:pStyle w:val="Nagwek2"/>
-      </w:pPr>
-      <w:bookmarkStart w:id="48" w:name="_Toc231028574"/>
-      <w:r>
-        <w:t>Wnioski końcowe</w:t>
-      </w:r>
-      <w:bookmarkEnd w:id="48"/>
-    </w:p>
-    <w:p>
-      <w:pPr>
-        <w:pStyle w:val="Nagwek3"/>
-      </w:pPr>
-      <w:bookmarkStart w:id="49" w:name="_Toc231028575"/>
-      <w:r>
-        <w:t>Podsumowanie</w:t>
-      </w:r>
-      <w:bookmarkEnd w:id="49"/>
     </w:p>
     <w:p>
       <w:r>
@@ -9273,11 +9263,11 @@
       <w:pPr>
         <w:pStyle w:val="Nagwek3"/>
       </w:pPr>
-      <w:bookmarkStart w:id="50" w:name="_Toc231028576"/>
+      <w:bookmarkStart w:id="48" w:name="_Toc231028576"/>
       <w:r>
         <w:t>Ograniczenia</w:t>
       </w:r>
-      <w:bookmarkEnd w:id="50"/>
+      <w:bookmarkEnd w:id="48"/>
     </w:p>
     <w:p>
       <w:r>
@@ -9288,26 +9278,16 @@
       <w:pPr>
         <w:pStyle w:val="Nagwek3"/>
       </w:pPr>
-      <w:bookmarkStart w:id="51" w:name="_Toc231028577"/>
+      <w:bookmarkStart w:id="49" w:name="_Toc231028577"/>
       <w:r>
         <w:t>Podsumowanie końcowe</w:t>
       </w:r>
-      <w:bookmarkEnd w:id="51"/>
+      <w:bookmarkEnd w:id="49"/>
     </w:p>
     <w:p>
       <w:r>
         <w:t>Przeprowadzone badanie pokazuje, że w prognozowaniu naruszeń danych w chmurze nie ma jednej, bezdyskusyjnie najlepszej metody; wybór jest kompromisem między skutecznością a kosztem, szybkością i zrozumiałością decyzji. Dla danych opisujących ruch sieciowy las losowy okazuje się wyjątkowo silnym i tanim rozwiązaniem, któremu sieci głębokie co najwyżej dorównują, lecz go nie prześcigają, i to dopiero za cenę znacznie większego nakładu obliczeniowego. Płynie z tego praktyczny wniosek: zanim sięgnie się po skomplikowane sieci neuronowe, warto najpierw wypróbować dobrze dobraną metodę klasyczną.</w:t>
       </w:r>
-    </w:p>
-    <w:p>
-      <w:pPr>
-        <w:pStyle w:val="Nagwek2"/>
-      </w:pPr>
-      <w:bookmarkStart w:id="52" w:name="_Toc231028578"/>
-      <w:r>
-        <w:t>Bibliografia</w:t>
-      </w:r>
-      <w:bookmarkEnd w:id="52"/>
     </w:p>
     <w:p>
       <w:pPr>
@@ -9315,339 +9295,6 @@
           <w:lang w:val="en-GB"/>
         </w:rPr>
       </w:pPr>
-      <w:r>
-        <w:rPr>
-          <w:lang w:val="en-GB"/>
-        </w:rPr>
-        <w:t xml:space="preserve">[1] </w:t>
-      </w:r>
-      <w:proofErr w:type="spellStart"/>
-      <w:r>
-        <w:rPr>
-          <w:lang w:val="en-GB"/>
-        </w:rPr>
-        <w:t>Breiman</w:t>
-      </w:r>
-      <w:proofErr w:type="spellEnd"/>
-      <w:r>
-        <w:rPr>
-          <w:lang w:val="en-GB"/>
-        </w:rPr>
-        <w:t xml:space="preserve"> L., Random Forests, Machine Learning, 45(1), 5-32, 2001.</w:t>
-      </w:r>
-    </w:p>
-    <w:p>
-      <w:pPr>
-        <w:rPr>
-          <w:lang w:val="en-GB"/>
-        </w:rPr>
-      </w:pPr>
-      <w:r>
-        <w:rPr>
-          <w:lang w:val="en-GB"/>
-        </w:rPr>
-        <w:t xml:space="preserve">[2] Hochreiter S., </w:t>
-      </w:r>
-      <w:proofErr w:type="spellStart"/>
-      <w:r>
-        <w:rPr>
-          <w:lang w:val="en-GB"/>
-        </w:rPr>
-        <w:t>Schmidhuber</w:t>
-      </w:r>
-      <w:proofErr w:type="spellEnd"/>
-      <w:r>
-        <w:rPr>
-          <w:lang w:val="en-GB"/>
-        </w:rPr>
-        <w:t xml:space="preserve"> J., Long Short-Term Memory, Neural Computation, 9(8), 1735-1780, 1997.</w:t>
-      </w:r>
-    </w:p>
-    <w:p>
-      <w:pPr>
-        <w:rPr>
-          <w:lang w:val="en-GB"/>
-        </w:rPr>
-      </w:pPr>
-      <w:r>
-        <w:rPr>
-          <w:lang w:val="en-GB"/>
-        </w:rPr>
-        <w:t xml:space="preserve">[3] LeCun Y., </w:t>
-      </w:r>
-      <w:proofErr w:type="spellStart"/>
-      <w:r>
-        <w:rPr>
-          <w:lang w:val="en-GB"/>
-        </w:rPr>
-        <w:t>Bottou</w:t>
-      </w:r>
-      <w:proofErr w:type="spellEnd"/>
-      <w:r>
-        <w:rPr>
-          <w:lang w:val="en-GB"/>
-        </w:rPr>
-        <w:t xml:space="preserve"> L., Bengio Y., Haffner P., Gradient-Based Learning Applied to Document Recognition, Proceedings of the IEEE, 86(11), 2278-2324, 1998.</w:t>
-      </w:r>
-    </w:p>
-    <w:p>
-      <w:pPr>
-        <w:rPr>
-          <w:lang w:val="en-GB"/>
-        </w:rPr>
-      </w:pPr>
-      <w:r>
-        <w:rPr>
-          <w:lang w:val="en-GB"/>
-        </w:rPr>
-        <w:t xml:space="preserve">[4] </w:t>
-      </w:r>
-      <w:proofErr w:type="spellStart"/>
-      <w:r>
-        <w:rPr>
-          <w:lang w:val="en-GB"/>
-        </w:rPr>
-        <w:t>Sharafaldin</w:t>
-      </w:r>
-      <w:proofErr w:type="spellEnd"/>
-      <w:r>
-        <w:rPr>
-          <w:lang w:val="en-GB"/>
-        </w:rPr>
-        <w:t xml:space="preserve"> I., Lashkari A. H., Ghorbani A. A., Toward Generating a New Intrusion Detection Dataset and Intrusion Traffic Characterization, ICISSP, 108-116, 2018.</w:t>
-      </w:r>
-    </w:p>
-    <w:p>
-      <w:pPr>
-        <w:rPr>
-          <w:lang w:val="en-GB"/>
-        </w:rPr>
-      </w:pPr>
-      <w:r>
-        <w:rPr>
-          <w:lang w:val="en-GB"/>
-        </w:rPr>
-        <w:t xml:space="preserve">[5] Moustafa N., Slay J., UNSW-NB15: A Comprehensive Data Set for Network Intrusion Detection Systems, </w:t>
-      </w:r>
-      <w:proofErr w:type="spellStart"/>
-      <w:r>
-        <w:rPr>
-          <w:lang w:val="en-GB"/>
-        </w:rPr>
-        <w:t>MilCIS</w:t>
-      </w:r>
-      <w:proofErr w:type="spellEnd"/>
-      <w:r>
-        <w:rPr>
-          <w:lang w:val="en-GB"/>
-        </w:rPr>
-        <w:t>, 1-6, 2015.</w:t>
-      </w:r>
-    </w:p>
-    <w:p>
-      <w:pPr>
-        <w:rPr>
-          <w:lang w:val="en-GB"/>
-        </w:rPr>
-      </w:pPr>
-      <w:r>
-        <w:rPr>
-          <w:lang w:val="en-GB"/>
-        </w:rPr>
-        <w:t xml:space="preserve">[6] </w:t>
-      </w:r>
-      <w:proofErr w:type="spellStart"/>
-      <w:r>
-        <w:rPr>
-          <w:lang w:val="en-GB"/>
-        </w:rPr>
-        <w:t>Tavallaee</w:t>
-      </w:r>
-      <w:proofErr w:type="spellEnd"/>
-      <w:r>
-        <w:rPr>
-          <w:lang w:val="en-GB"/>
-        </w:rPr>
-        <w:t xml:space="preserve"> M., Bagheri E., Lu W., Ghorbani A. A., A Detailed Analysis of the KDD CUP 99 Data Set, IEEE CISDA, 1-6, 2009.</w:t>
-      </w:r>
-    </w:p>
-    <w:p>
-      <w:pPr>
-        <w:rPr>
-          <w:lang w:val="en-GB"/>
-        </w:rPr>
-      </w:pPr>
-      <w:r>
-        <w:rPr>
-          <w:lang w:val="en-GB"/>
-        </w:rPr>
-        <w:t xml:space="preserve">[7] </w:t>
-      </w:r>
-      <w:proofErr w:type="spellStart"/>
-      <w:r>
-        <w:rPr>
-          <w:lang w:val="en-GB"/>
-        </w:rPr>
-        <w:t>Grinsztajn</w:t>
-      </w:r>
-      <w:proofErr w:type="spellEnd"/>
-      <w:r>
-        <w:rPr>
-          <w:lang w:val="en-GB"/>
-        </w:rPr>
-        <w:t xml:space="preserve"> L., </w:t>
-      </w:r>
-      <w:proofErr w:type="spellStart"/>
-      <w:r>
-        <w:rPr>
-          <w:lang w:val="en-GB"/>
-        </w:rPr>
-        <w:t>Oyallon</w:t>
-      </w:r>
-      <w:proofErr w:type="spellEnd"/>
-      <w:r>
-        <w:rPr>
-          <w:lang w:val="en-GB"/>
-        </w:rPr>
-        <w:t xml:space="preserve"> E., Varoquaux G., Why Do Tree-Based Models Still Outperform Deep Learning on Typical Tabular </w:t>
-      </w:r>
-      <w:proofErr w:type="gramStart"/>
-      <w:r>
-        <w:rPr>
-          <w:lang w:val="en-GB"/>
-        </w:rPr>
-        <w:t>Data?,</w:t>
-      </w:r>
-      <w:proofErr w:type="gramEnd"/>
-      <w:r>
-        <w:rPr>
-          <w:lang w:val="en-GB"/>
-        </w:rPr>
-        <w:t xml:space="preserve"> </w:t>
-      </w:r>
-      <w:proofErr w:type="spellStart"/>
-      <w:r>
-        <w:rPr>
-          <w:lang w:val="en-GB"/>
-        </w:rPr>
-        <w:t>NeurIPS</w:t>
-      </w:r>
-      <w:proofErr w:type="spellEnd"/>
-      <w:r>
-        <w:rPr>
-          <w:lang w:val="en-GB"/>
-        </w:rPr>
-        <w:t>, 2022.</w:t>
-      </w:r>
-    </w:p>
-    <w:p>
-      <w:pPr>
-        <w:rPr>
-          <w:lang w:val="en-GB"/>
-        </w:rPr>
-      </w:pPr>
-      <w:r>
-        <w:rPr>
-          <w:lang w:val="en-GB"/>
-        </w:rPr>
-        <w:t>[8] Goodfellow I., Bengio Y., Courville A., Deep Learning, MIT Press, 2016.</w:t>
-      </w:r>
-    </w:p>
-    <w:p>
-      <w:pPr>
-        <w:rPr>
-          <w:lang w:val="en-GB"/>
-        </w:rPr>
-      </w:pPr>
-      <w:r>
-        <w:rPr>
-          <w:lang w:val="en-GB"/>
-        </w:rPr>
-        <w:t xml:space="preserve">[9] Pedregosa F. </w:t>
-      </w:r>
-      <w:proofErr w:type="spellStart"/>
-      <w:r>
-        <w:rPr>
-          <w:lang w:val="en-GB"/>
-        </w:rPr>
-        <w:t>i</w:t>
-      </w:r>
-      <w:proofErr w:type="spellEnd"/>
-      <w:r>
-        <w:rPr>
-          <w:lang w:val="en-GB"/>
-        </w:rPr>
-        <w:t xml:space="preserve"> in., Scikit-learn: Machine Learning in Python, JMLR, 12, 2825-2830, 2011.</w:t>
-      </w:r>
-    </w:p>
-    <w:p>
-      <w:pPr>
-        <w:rPr>
-          <w:lang w:val="en-GB"/>
-        </w:rPr>
-      </w:pPr>
-      <w:r>
-        <w:rPr>
-          <w:lang w:val="en-GB"/>
-        </w:rPr>
-        <w:t xml:space="preserve">[10] </w:t>
-      </w:r>
-      <w:proofErr w:type="spellStart"/>
-      <w:r>
-        <w:rPr>
-          <w:lang w:val="en-GB"/>
-        </w:rPr>
-        <w:t>Paszke</w:t>
-      </w:r>
-      <w:proofErr w:type="spellEnd"/>
-      <w:r>
-        <w:rPr>
-          <w:lang w:val="en-GB"/>
-        </w:rPr>
-        <w:t xml:space="preserve"> A. </w:t>
-      </w:r>
-      <w:proofErr w:type="spellStart"/>
-      <w:r>
-        <w:rPr>
-          <w:lang w:val="en-GB"/>
-        </w:rPr>
-        <w:t>i</w:t>
-      </w:r>
-      <w:proofErr w:type="spellEnd"/>
-      <w:r>
-        <w:rPr>
-          <w:lang w:val="en-GB"/>
-        </w:rPr>
-        <w:t xml:space="preserve"> in., </w:t>
-      </w:r>
-      <w:proofErr w:type="spellStart"/>
-      <w:r>
-        <w:rPr>
-          <w:lang w:val="en-GB"/>
-        </w:rPr>
-        <w:t>PyTorch</w:t>
-      </w:r>
-      <w:proofErr w:type="spellEnd"/>
-      <w:r>
-        <w:rPr>
-          <w:lang w:val="en-GB"/>
-        </w:rPr>
-        <w:t xml:space="preserve">: An Imperative Style, High-Performance Deep Learning Library, </w:t>
-      </w:r>
-      <w:proofErr w:type="spellStart"/>
-      <w:r>
-        <w:rPr>
-          <w:lang w:val="en-GB"/>
-        </w:rPr>
-        <w:t>NeurIPS</w:t>
-      </w:r>
-      <w:proofErr w:type="spellEnd"/>
-      <w:r>
-        <w:rPr>
-          <w:lang w:val="en-GB"/>
-        </w:rPr>
-        <w:t>, 2019.</w:t>
-      </w:r>
     </w:p>
     <w:sectPr>
       <w:footerReference w:type="even" r:id="rId18"/>

</xml_diff>